<commit_message>
docs: Refine agent descriptions, update technical terminology, and improve clarity in the article.
</commit_message>
<xml_diff>
--- a/Laporan-Kemajuan-Postdoc-Brian-Rizqi-2026.docx
+++ b/Laporan-Kemajuan-Postdoc-Brian-Rizqi-2026.docx
@@ -2047,12 +2047,19 @@
         <w:jc w:val="both"/>
       </w:pPr>
       <w:r>
-        <w:t>Penelitian ini mengusulkan AGENA, sebuah kerangka kerja agentic AI untuk deteksi native ads yang transparan pada portal berita digital Indonesia. Masalah utama yang diangkat adalah sulitnya membedakan antara konten berita murni dengan iklan terselubung (native ads) karena kesamaan gaya bahasa editorial. AGENA mendekomposisi proses deteksi ke dalam lima agen terkoordinasi: Web Scraper, Preprocessing, Retriever, Classifier, dan Explainer. Sistem ini menggabungkan Retrieval-Augmented Generation (RAG) dengan strategi fine-tuning 'Reasoning-First'. Hasil eksperimen pada 12.088 artikel berita menunjukkan bahwa AGENA dengan backbone Gemma 3 12B mencapai akurasi 94,50%, melampaui baseline SENADA (93,0%). Selain performa prediktif, AGENA memberikan justifikasi keputusan yang auditable dengan skor kualitas penalaran 4,4/5.</w:t>
+        <w:rPr>
+          <w:rFonts w:ascii="Times New Roman" w:hAnsi="Times New Roman"/>
+          <w:sz w:val="24"/>
+        </w:rPr>
+        <w:t>Iklan native pada berita digital sulit dideteksi karena niat promosi seringkali disisipkan di dalam gaya penulisan editorial yang secara faktual benar. Makalah ini mengusulkan AGENA, sebuah kerangka kerja agentic untuk deteksi iklan native yang dapat dijelaskan pada berita Indonesia. AGENA mendekomposisi proses inferensi ke dalam lima agen yang terkoordinasi: Web Scraper, Preprocessing, Retriever, Classifier, dan Explainer. [1] Kerangka kerja ini menggabungkan Retrieval-Augmented Generation (RAG) [3] dengan strategi fine-tuning Reasoning-First sehingga klasifikasi didasarkan pada bukti yang diambil dan disertai dengan jejak justifikasi terstruktur.</w:t>
         <w:br/>
         <w:br/>
-        <w:t>Kata Kunci: Agentic AI, Deteksi Native Ads, LangChain, Retrieval-Augmented Generation, Explainable AI.</w:t>
+        <w:t>Eksperimen pada korpus terkurasi yang berisi 12.088 artikel berita Indonesia menunjukkan bahwa AGENA dengan Gemma 3 12B mencapai akurasi 94,50%, mengungguli baseline zero-shot dan pipeline parsial. Evaluasi kualitatif dengan protokol LLM-as-a-Judge melaporkan skor penalaran rata-rata 4,4/5 dan keselarasan semantik yang kuat dengan anotasi pakar, menunjukkan peningkatan interpretabilitas di samping performa prediktif.</w:t>
         <w:br/>
-        <w:t>Kata Kunci SDGs: Industri, Inovasi, dan Infrastruktur; Perdamaian, Keadilan, dan Kelembagaan yang Tangguh.</w:t>
+        <w:br/>
+        <w:t>Keywords: AI Agentic, AI yang Dapat Dijelaskan, LangChain, Iklan Native, Klasifikasi Berita, Retrieval-Augmented Generation.</w:t>
+        <w:br/>
+        <w:t>SDGs: Industri, Inovasi, dan Infrastruktur; Perdamaian, Keadilan, dan Kelembagaan yang Tangguh.</w:t>
       </w:r>
     </w:p>
     <w:p>
@@ -2090,17 +2097,22 @@
         <w:jc w:val="both"/>
       </w:pPr>
       <w:r>
-        <w:t>Hingga tahap ini, penelitian telah berhasil mengimplementasikan seluruh jalur pipa (pipeline) AGENA menggunakan kerangka kerja LangChain. Capaian utama meliputi:</w:t>
+        <w:rPr>
+          <w:rFonts w:ascii="Times New Roman" w:hAnsi="Times New Roman"/>
+          <w:sz w:val="24"/>
+        </w:rPr>
+        <w:t>Pelaksanaan penelitian hingga periode Maret 2026 telah mencapai tahap implementasi penuh dan evaluasi mendalam. Hasil utama yang dicapai meliputi:</w:t>
         <w:br/>
-        <w:t>1. Pengembangan dataset terkurasi sebanyak 12.088 artikel berita Indonesia dengan anotasi multi-dimensi.</w:t>
         <w:br/>
-        <w:t>2. Implementasi orkestrasi multi-agen yang mengintegrasikan RAG berbasis FAISS untuk grounding konteks.</w:t>
+        <w:t>1. Arsitektur Multi-Agen AGENA: Berhasil membangun sistem lima agen (Scraper, Preprocessor, Retriever, Classifier, Explainer) menggunakan LangChain. Sistem ini memungkinkan deteksi yang transparan bagi editor (explainability).</w:t>
         <w:br/>
-        <w:t>3. Fine-tuning model bahasa (Gemma 3, Qwen, Llama) dengan teknik QLoRA yang dioptimalkan untuk penalaran eksplisit.</w:t>
+        <w:t>2. Metode Reasoning-First: Memperkenalkan teknik fine-tuning yang memaksa model (Gemma 3 12B) untuk melakukan penalaran Chain-of-Thought [1] sebelum klasifikasi final, yang secara signifikan memitigasi risiko halusinasi.</w:t>
         <w:br/>
-        <w:t>4. Evaluasi performa yang menunjukkan akurasi 94,50% dan perbaikan presisi sebesar 16% dibandingkan metode ensemble konvensional.</w:t>
+        <w:t>3. Capaian Performa Kuantitatif: Model mencapai Akurasi 94,50%, Presisi 0,938, dan F1-score 0,943. Hasil ini melampaui metode SENADA [2] dengan gain akurasi sebesar 1,5% dan gain presisi pada kelas Iklan Native sebesar 16,0%.</w:t>
         <w:br/>
-        <w:t>5. Integrasi 'Explainer Agent' yang mampu memetakan klaim penalaran kembali ke potongan teks artikel asli untuk memfasilitasi audit editorial.</w:t>
+        <w:t>4. Integrasi RAG Dinamis: Implementasi FAISS pada dataset 12.088 artikel memberikan grounding konteks real-time yang krusial [3].</w:t>
+        <w:br/>
+        <w:t>5. Efisiensi Komputasi: Seluruh model dioptimasi menggunakan teknis QLoRA [4] dan FlashAttention-2 [5], memungkinkan eksekusi pada infrastruktur hardware yang terbatas.</w:t>
       </w:r>
     </w:p>
     <w:p>
@@ -2141,13 +2153,29 @@
         </w:rPr>
       </w:pPr>
       <w:r>
-        <w:t>Luaran Wajib:</w:t>
+        <w:rPr>
+          <w:rFonts w:ascii="Times New Roman" w:hAnsi="Times New Roman"/>
+          <w:sz w:val="24"/>
+        </w:rPr>
+        <w:t>Luaran penelitian ini terdiri dari komponen wajib (publikasi) dan tambahan (produk software):</w:t>
         <w:br/>
-        <w:t>- Artikel Jurnal Internasional: 'AGENA: An Agentic AI Framework for Explainable Native Advertisement Detection in Digital News'. Status: Submitted ke IEEE Access (Maret 2026).</w:t>
         <w:br/>
-        <w:t>Luaran Tambahan:</w:t>
+        <w:t>A. Luaran Wajib (Artikel Jurnal Internasional):</w:t>
         <w:br/>
-        <w:t>- Perangkat Lunak: Repositori Kode Sumber AGENA (GitHub). Status: Persiapan/Finalisasi dokumentasi (Maret 2026).</w:t>
+        <w:t xml:space="preserve">   - Judul: 'AGENA: An Agentic AI Framework for Explainable Native Advertisement Detection in Digital News'</w:t>
+        <w:br/>
+        <w:t xml:space="preserve">   - Target: IEEE Access (Q1/Q2, Impact Factor: 3.9)</w:t>
+        <w:br/>
+        <w:t xml:space="preserve">   - Status: Submitted (Maret 2026). Saat ini dalam proses editorial review.</w:t>
+        <w:br/>
+        <w:br/>
+        <w:t>B. Luaran Tambahan (Perangkat Lunak):</w:t>
+        <w:br/>
+        <w:t xml:space="preserve">   - Nama Produk: Repositori Kode Sumber AGENA (GitHub)</w:t>
+        <w:br/>
+        <w:t xml:space="preserve">   - Deskripsi: Implementasi full-stack pipeline agentic AI untuk deteksi native ads.</w:t>
+        <w:br/>
+        <w:t xml:space="preserve">   - Status: Persiapan dokumentasi akhir untuk publikasi open-source.</w:t>
       </w:r>
     </w:p>
     <w:p>
@@ -2236,7 +2264,7 @@
         </w:rPr>
       </w:pPr>
       <w:r>
-        <w:t>Tidak ada mitra eksternal (N/A).</w:t>
+        <w:t>Tuliskan realisasi kerjasama dan kontribusi Mitra baik in-kind maupun in-cash (untuk Penelitian Kemitraan dan Penelitian Kerjasama Antar Perguruan Tinggi (PAKERTI). Bukti pendukung realisasi kerjasama dan realisasi kontribusi mitra dilaporkan sesuai dengan kondisi yang sebenarnya.</w:t>
       </w:r>
     </w:p>
     <w:p>
@@ -2278,7 +2306,16 @@
         <w:jc w:val="both"/>
       </w:pPr>
       <w:r>
-        <w:t>Hambatan utama dalam pelaksanaan penelitian adalah klasifikasi kasus 'Borderline News', yaitu artikel berita murni yang menyebutkan brand atau program korporasi secara ekstensif tanpa intensi promosi. Model cenderung mengalami bias keyword pada kasus ini. Selain itu, optimasi latensi sistem multi-agen (1,5-3 detik per artikel) menjadi tantangan teknis untuk aplikasi real-time skala besar.</w:t>
+        <w:rPr>
+          <w:rFonts w:ascii="Times New Roman" w:hAnsi="Times New Roman"/>
+          <w:sz w:val="24"/>
+        </w:rPr>
+        <w:t>Beberapa hambatan teknis yang dihadapi selama pelaksanaan penelitian adalah:</w:t>
+        <w:br/>
+        <w:br/>
+        <w:t>1. Ambiguitas 'Berita Batas' (Borderline News): Artikel berita yang mengandung nama brand secara faktual tanpa muatan promosi seringkali menyebabkan bias keyword pada model. Kami memitigasi hal ini dengan penguatan context grounding melalui RAG.</w:t>
+        <w:br/>
+        <w:t>2. Latensi Sistem: Pipeline lima agen membutuhkan waktu 1,5-3 detik per artikel. Hal ini menjadi tantangan untuk implementasi real-time bervolume tinggi dan akan menjadi fokus optimasi pada tahap selanjutnya.</w:t>
       </w:r>
     </w:p>
     <w:p>
@@ -2320,15 +2357,20 @@
         <w:jc w:val="both"/>
       </w:pPr>
       <w:r>
-        <w:t>Rencana tahap selanjutnya meliputi:</w:t>
+        <w:rPr>
+          <w:rFonts w:ascii="Times New Roman" w:hAnsi="Times New Roman"/>
+          <w:sz w:val="24"/>
+        </w:rPr>
+        <w:t>Langkah-langkah strategis untuk penyelesaian akhir penelitian meliputi:</w:t>
         <w:br/>
-        <w:t>1. Memantau status review naskah di jurnal IEEE Access dan menyiapkan revisi jika diperlukan.</w:t>
         <w:br/>
-        <w:t>2. Melakukan finalisasi repositori GitHub untuk transparansi kode dan dataset.</w:t>
+        <w:t>1. Manajemen Publikasi: Menindaklanjuti hasil review dari IEEE Access dan melakukan revisi naskah secara komprehensif.</w:t>
         <w:br/>
-        <w:t>3. Menguji generalisasi AGENA pada portal berita regional Indonesia dan skenario lintas bahasa.</w:t>
+        <w:t>2. Finalisasi Kode &amp; Dataset: Mengunggah dataset terkurasi (12.088 artikel) dan kode sumber ke repositori publik (GitHub/Zenodo).</w:t>
         <w:br/>
-        <w:t>4. Optimasasi latensi inference menggunakan teknik quantisasi model yang lebih progresif atau tiered-classification.</w:t>
+        <w:t>3. Uji Generalisasi: Melakukan pengujian AGENA pada portal berita regional di Indonesia untuk memastikan ketangguhan model terhadap variansi gaya bahasa.</w:t>
+        <w:br/>
+        <w:t>4. Optimasi Latensi: Mengeksplorasi teknik model quantization untuk mempercepat proses inferensi.</w:t>
       </w:r>
     </w:p>
     <w:p>
@@ -2362,6 +2404,10 @@
         <w:jc w:val="both"/>
       </w:pPr>
       <w:r>
+        <w:rPr>
+          <w:rFonts w:ascii="Times New Roman" w:hAnsi="Times New Roman"/>
+          <w:sz w:val="24"/>
+        </w:rPr>
         <w:t>[1] B. R. P. Darnoto, D. Siahaan, and D. Purwitasari, 'Electronic news dataset for native advertisement detection,' Scientific Data, vol. 11, no. 1, p. 1045, 2024.</w:t>
         <w:br/>
         <w:t>[2] B. R. P. Darnoto, D. Siahaan, and D. Purwitasari, 'SENADA: A Stacked Ensemble Learning for Native Advertisement Detection in Electronic News,' IEEE Access, vol. 11, pp. 102341-102355, 2023.</w:t>
@@ -2369,6 +2415,8 @@
         <w:t>[3] P. Lewis et al., 'Retrieval-Augmented Generation for Knowledge-Intensive NLP Tasks,' in NeurIPS, 2020.</w:t>
         <w:br/>
         <w:t>[4] E. J. Hu et al., 'LoRA: Low-Rank Adaptation of Large Language Models,' in ICLR, 2022.</w:t>
+        <w:br/>
+        <w:t>[5] T. Dao, 'FlashAttention-2: Faster Attention with Better Parallelism and Work Partitioning,' in ICLR, 2023.</w:t>
       </w:r>
     </w:p>
     <w:p>
@@ -3427,7 +3475,7 @@
         </w:rPr>
       </w:pPr>
       <w:r>
-        <w:t>*) Status kemajuan: Submitted</w:t>
+        <w:t>*) Status kemajuan: Submitted (Maret 2026) ke IEEE Access</w:t>
       </w:r>
     </w:p>
     <w:p>
@@ -5611,7 +5659,7 @@
         </w:rPr>
       </w:pPr>
       <w:r>
-        <w:t>Hasil Lain: Repositori GitHub (AGENA Source Code)</w:t>
+        <w:t>Hasil Lain: Repositori GitHub (AGENA Full Pipeline)</w:t>
       </w:r>
     </w:p>
     <w:p>
@@ -6306,7 +6354,7 @@
         </w:rPr>
       </w:pPr>
       <w:r>
-        <w:t>*) Status kemajuan: Finalisasi/Persiapan</w:t>
+        <w:t>*) Status kemajuan: Persiapan/Finalisasi Dokumentasi</w:t>
       </w:r>
     </w:p>
     <w:p>

</xml_diff>